<commit_message>
done faes and mega correction
</commit_message>
<xml_diff>
--- a/specific_situation/samaritans_purse_senior_meal/outputs/Alexandro_Disla_CV_SamaritansPurse_FR.docx
+++ b/specific_situation/samaritans_purse_senior_meal/outputs/Alexandro_Disla_CV_SamaritansPurse_FR.docx
@@ -616,13 +616,13 @@
       </w:r>
     </w:p>
     <w:bookmarkEnd w:id="14"/>
-    <w:bookmarkStart w:id="15" w:name="Xe848f794237be481f3243fb33c8f38fa9fbd0e5"/>
+    <w:bookmarkStart w:id="15" w:name="X95c32231c12054db65ff807b338342c0e46dd57"/>
     <w:p>
       <w:pPr>
         <w:pStyle w:val="Heading3"/>
       </w:pPr>
       <w:r>
-        <w:t xml:space="preserve">Économiste — Service de Planification Économique | Ministère de la Planification (MPCE)</w:t>
+        <w:t xml:space="preserve">Économiste — Direction de Planification Économique et Sociale (DPES) | Ministère de la Planification et de la Coopération Externe (MPCE)</w:t>
       </w:r>
     </w:p>
     <w:p>
@@ -634,7 +634,7 @@
           <w:i/>
           <w:iCs/>
         </w:rPr>
-        <w:t xml:space="preserve">2014 – 2015 | Haïti</w:t>
+        <w:t xml:space="preserve">Nov 2015 – Août 2023 | Port-au-Prince</w:t>
       </w:r>
     </w:p>
     <w:p>
@@ -646,19 +646,31 @@
         </w:numPr>
       </w:pPr>
       <w:r>
-        <w:t xml:space="preserve">Suivi des indicateurs macroéconomiques et contribution en analyse statistique aux rapports de</w:t>
-      </w:r>
-      <w:r>
-        <w:t xml:space="preserve"> </w:t>
-      </w:r>
-      <w:r>
-        <w:t xml:space="preserve">politiques publiques ; collaboration avec l’équipe de modélisation sur les simulations</w:t>
-      </w:r>
-      <w:r>
-        <w:t xml:space="preserve"> </w:t>
-      </w:r>
-      <w:r>
-        <w:t xml:space="preserve">d’impact socio-économique.</w:t>
+        <w:t xml:space="preserve">Contribution aux rapports de suivi de l’exécution du Plan Triennal d’Investissement 2014–2016 ;</w:t>
+      </w:r>
+      <w:r>
+        <w:t xml:space="preserve"> </w:t>
+      </w:r>
+      <w:r>
+        <w:t xml:space="preserve">affectation à l’unité statistique et modélisation, avec participation à la construction du</w:t>
+      </w:r>
+      <w:r>
+        <w:t xml:space="preserve"> </w:t>
+      </w:r>
+      <w:r>
+        <w:t xml:space="preserve">« Modèle de Planification du Développement », outil de prévision, de simulation et d’analyse</w:t>
+      </w:r>
+      <w:r>
+        <w:t xml:space="preserve"> </w:t>
+      </w:r>
+      <w:r>
+        <w:t xml:space="preserve">d’impact des politiques publiques ; suivi des indicateurs macroéconomiques avec le Ministère de</w:t>
+      </w:r>
+      <w:r>
+        <w:t xml:space="preserve"> </w:t>
+      </w:r>
+      <w:r>
+        <w:t xml:space="preserve">l’Économie et des Finances.</w:t>
       </w:r>
     </w:p>
     <w:bookmarkEnd w:id="15"/>

</xml_diff>